<commit_message>
Appréciation v3.7 : seule la personne en appréciation choisit le type de poste
Les gestionnaires ne peuvent plus choisir le type de poste : l'application
leur demande d'ouvrir le dossier de la personne (Mes dossiers, puis Charger
un dossier). Guides mis à jour.

Co-Authored-By: Claude Opus 5.5 <noreply@anthropic.com>
Claude-Session: https://claude.ai/code/session_01FRdAzq8p3F9gJJe5MA3G79
</commit_message>
<xml_diff>
--- a/sharepoint-html-kit/appreciation/1-GUIDE-INSTALLATION.docx
+++ b/sharepoint-html-kit/appreciation/1-GUIDE-INSTALLATION.docx
@@ -2,13 +2,13 @@
 <file path=word/document.xml><?xml version="1.0" encoding="utf-8"?>
 <w:document xmlns:w="http://schemas.openxmlformats.org/wordprocessingml/2006/main" xmlns:m="http://schemas.openxmlformats.org/officeDocument/2006/math" xmlns:r="http://schemas.openxmlformats.org/officeDocument/2006/relationships" xmlns:o="urn:schemas-microsoft-com:office:office" xmlns:v="urn:schemas-microsoft-com:vml" xmlns:w10="urn:schemas-microsoft-com:office:word" xmlns:a="http://schemas.openxmlformats.org/drawingml/2006/main" xmlns:pic="http://schemas.openxmlformats.org/drawingml/2006/picture" xmlns:wp="http://schemas.openxmlformats.org/drawingml/2006/wordprocessingDrawing">
   <w:body>
-    <w:bookmarkStart w:id="27" w:name="Xd9e9f2f55a9e5fb95393f01efca4b832a4a28cb"/>
+    <w:bookmarkStart w:id="27" w:name="X268fc978120e4a9fe48955bc446f9fd40a7a46b"/>
     <w:p>
       <w:pPr>
         <w:pStyle w:val="Heading1"/>
       </w:pPr>
       <w:r>
-        <w:t xml:space="preserve">Guide d’installation — Appréciation de la contribution (version 3.6)</w:t>
+        <w:t xml:space="preserve">Guide d’installation — Appréciation de la contribution (version 3.7)</w:t>
       </w:r>
     </w:p>
     <w:p>
@@ -108,7 +108,7 @@
               <w:rPr>
                 <w:rStyle w:val="VerbatimChar"/>
               </w:rPr>
-              <w:t xml:space="preserve">appreciation-cadres-v3.6.html</w:t>
+              <w:t xml:space="preserve">appreciation-cadres-v3.7.html</w:t>
             </w:r>
           </w:p>
         </w:tc>
@@ -1095,7 +1095,7 @@
         <w:rPr>
           <w:rStyle w:val="VerbatimChar"/>
         </w:rPr>
-        <w:t xml:space="preserve">appreciation-cadres-v3.6.html</w:t>
+        <w:t xml:space="preserve">appreciation-cadres-v3.7.html</w:t>
       </w:r>
       <w:r>
         <w:t xml:space="preserve">.</w:t>
@@ -1214,7 +1214,7 @@
         <w:t xml:space="preserve"> </w:t>
       </w:r>
       <w:r>
-        <w:t xml:space="preserve">: le lien reste le même et l’historique garde l’ancienne. Si le nom change (par exemple v3.6 → v3.7), supprimez l’ancienne.</w:t>
+        <w:t xml:space="preserve">: le lien reste le même et l’historique garde l’ancienne. Si le nom change (par exemple v3.7 → v3.7), supprimez l’ancienne.</w:t>
       </w:r>
     </w:p>
     <w:bookmarkEnd w:id="23"/>

</xml_diff>